<commit_message>
Documentation: update operator manuals (Zev-7, WordClock 1-4, RingClock/BitClock) — DOCX + PDF
</commit_message>
<xml_diff>
--- a/RingClock-BitClock-Manual.docx
+++ b/RingClock-BitClock-Manual.docx
@@ -8887,6 +8887,15 @@
           <w:sz w:val="22"/>
         </w:rPr>
         <w:t>Both clocks can update their software over WiFi — no USB cable, no programming tools required. To trigger an update, hold SW1 for 10 seconds while the time is displayed. The clock contacts the firmware server, compares versions, downloads the new image if needed, flashes it, and reboots.</w:t>
+      </w:r>
+    </w:p>
+    <w:p>
+      <w:r>
+        <w:rPr>
+          <w:rFonts w:ascii="Arial" w:hAnsi="Arial"/>
+          <w:sz w:val="22"/>
+        </w:rPr>
+        <w:t>The firmware can also be updated from the web settings page, without using the button. On the System page, press Update Firmware. The settings form is replaced by a status message while the clock checks the firmware server. When the check completes, the result is shown — either confirmation that the firmware is already current (with its version number) or a brief error — and the page then returns to the home screen automatically. If a newer version is available, it is downloaded and installed and the clock reboots into it. The LED display shows the same update status described below regardless of whether the update is started from the button or the web page.</w:t>
       </w:r>
     </w:p>
     <w:p>

</xml_diff>